<commit_message>
segundo cambio: se agrego el link github
</commit_message>
<xml_diff>
--- a/parrales-john-desarrollo-de-la-informacion.docx
+++ b/parrales-john-desarrollo-de-la-informacion.docx
@@ -2639,7 +2639,6 @@
         <w:lastRenderedPageBreak/>
         <w:t>Categoría</w:t>
       </w:r>
-      <w:proofErr w:type="gramStart"/>
       <w:r>
         <w:rPr>
           <w:b/>
@@ -2659,15 +2658,7 @@
           <w:b/>
           <w:bCs/>
         </w:rPr>
-        <w:t>Patrón</w:t>
-      </w:r>
-      <w:proofErr w:type="gramEnd"/>
-      <w:r>
-        <w:rPr>
-          <w:b/>
-          <w:bCs/>
-        </w:rPr>
-        <w:t xml:space="preserve"> seleccionado</w:t>
+        <w:t>Patrón seleccionado</w:t>
       </w:r>
       <w:r>
         <w:rPr>
@@ -2698,7 +2689,6 @@
       <w:r>
         <w:t>Creacional</w:t>
       </w:r>
-      <w:proofErr w:type="gramStart"/>
       <w:r>
         <w:tab/>
       </w:r>
@@ -2706,11 +2696,7 @@
         <w:t xml:space="preserve">  </w:t>
       </w:r>
       <w:r>
-        <w:t>Factory</w:t>
-      </w:r>
-      <w:proofErr w:type="gramEnd"/>
-      <w:r>
-        <w:t xml:space="preserve"> Method</w:t>
+        <w:t>Factory Method</w:t>
       </w:r>
       <w:r>
         <w:tab/>
@@ -3039,11 +3025,9 @@
       <w:r>
         <w:t xml:space="preserve">Como ya </w:t>
       </w:r>
-      <w:proofErr w:type="gramStart"/>
       <w:r>
         <w:t>descargue</w:t>
       </w:r>
-      <w:proofErr w:type="gramEnd"/>
       <w:r>
         <w:t xml:space="preserve"> Git:</w:t>
       </w:r>
@@ -3333,7 +3317,6 @@
         <w:t xml:space="preserve"> --global </w:t>
       </w:r>
       <w:proofErr w:type="spellStart"/>
-      <w:proofErr w:type="gramStart"/>
       <w:r>
         <w:rPr>
           <w:b/>
@@ -3342,7 +3325,6 @@
         <w:t>user.email</w:t>
       </w:r>
       <w:proofErr w:type="spellEnd"/>
-      <w:proofErr w:type="gramEnd"/>
       <w:r>
         <w:rPr>
           <w:b/>
@@ -4384,16 +4366,54 @@
           <w:b/>
           <w:bCs/>
         </w:rPr>
+        <w:t xml:space="preserve"> add</w:t>
+      </w:r>
+      <w:r>
+        <w:rPr>
+          <w:b/>
+          <w:bCs/>
+        </w:rPr>
+        <w:t xml:space="preserve"> . </w:t>
+      </w:r>
+      <w:r>
+        <w:rPr>
+          <w:b/>
+          <w:bCs/>
+        </w:rPr>
+        <w:t>y aplastamos Enter</w:t>
+      </w:r>
+    </w:p>
+    <w:p>
+      <w:pPr>
+        <w:pStyle w:val="APASEPTIMA"/>
+      </w:pPr>
+      <w:r>
+        <w:t xml:space="preserve">Escribimos el </w:t>
+      </w:r>
+      <w:r>
+        <w:t>siguiente comando</w:t>
+      </w:r>
+      <w:r>
+        <w:rPr>
+          <w:b/>
+          <w:bCs/>
+        </w:rPr>
+        <w:t>:</w:t>
+      </w:r>
+      <w:r>
+        <w:rPr>
+          <w:b/>
+          <w:bCs/>
+        </w:rPr>
         <w:t xml:space="preserve"> </w:t>
       </w:r>
       <w:proofErr w:type="spellStart"/>
-      <w:proofErr w:type="gramStart"/>
-      <w:r>
-        <w:rPr>
-          <w:b/>
-          <w:bCs/>
-        </w:rPr>
-        <w:t>add</w:t>
+      <w:r>
+        <w:rPr>
+          <w:b/>
+          <w:bCs/>
+        </w:rPr>
+        <w:t>git</w:t>
       </w:r>
       <w:proofErr w:type="spellEnd"/>
       <w:r>
@@ -4401,55 +4421,15 @@
           <w:b/>
           <w:bCs/>
         </w:rPr>
-        <w:t xml:space="preserve"> .</w:t>
-      </w:r>
-      <w:proofErr w:type="gramEnd"/>
-      <w:r>
-        <w:rPr>
-          <w:b/>
-          <w:bCs/>
-        </w:rPr>
         <w:t xml:space="preserve"> </w:t>
       </w:r>
-      <w:r>
-        <w:rPr>
-          <w:b/>
-          <w:bCs/>
-        </w:rPr>
-        <w:t>y aplastamos Enter</w:t>
-      </w:r>
-    </w:p>
-    <w:p>
-      <w:pPr>
-        <w:pStyle w:val="APASEPTIMA"/>
-      </w:pPr>
-      <w:r>
-        <w:t xml:space="preserve">Escribimos el </w:t>
-      </w:r>
-      <w:r>
-        <w:t>siguiente comando</w:t>
-      </w:r>
-      <w:r>
-        <w:rPr>
-          <w:b/>
-          <w:bCs/>
-        </w:rPr>
-        <w:t>:</w:t>
-      </w:r>
-      <w:r>
-        <w:rPr>
-          <w:b/>
-          <w:bCs/>
-        </w:rPr>
-        <w:t xml:space="preserve"> </w:t>
-      </w:r>
       <w:proofErr w:type="spellStart"/>
       <w:r>
         <w:rPr>
           <w:b/>
           <w:bCs/>
         </w:rPr>
-        <w:t>git</w:t>
+        <w:t>commit</w:t>
       </w:r>
       <w:proofErr w:type="spellEnd"/>
       <w:r>
@@ -4457,7 +4437,7 @@
           <w:b/>
           <w:bCs/>
         </w:rPr>
-        <w:t xml:space="preserve"> </w:t>
+        <w:t xml:space="preserve"> -m "</w:t>
       </w:r>
       <w:proofErr w:type="spellStart"/>
       <w:r>
@@ -4473,7 +4453,7 @@
           <w:b/>
           <w:bCs/>
         </w:rPr>
-        <w:t xml:space="preserve"> -m "</w:t>
+        <w:t xml:space="preserve"> inicial: primera </w:t>
       </w:r>
       <w:proofErr w:type="spellStart"/>
       <w:r>
@@ -4481,7 +4461,7 @@
           <w:b/>
           <w:bCs/>
         </w:rPr>
-        <w:t>commit</w:t>
+        <w:t>version</w:t>
       </w:r>
       <w:proofErr w:type="spellEnd"/>
       <w:r>
@@ -4489,22 +4469,6 @@
           <w:b/>
           <w:bCs/>
         </w:rPr>
-        <w:t xml:space="preserve"> inicial: primera </w:t>
-      </w:r>
-      <w:proofErr w:type="spellStart"/>
-      <w:r>
-        <w:rPr>
-          <w:b/>
-          <w:bCs/>
-        </w:rPr>
-        <w:t>version</w:t>
-      </w:r>
-      <w:proofErr w:type="spellEnd"/>
-      <w:r>
-        <w:rPr>
-          <w:b/>
-          <w:bCs/>
-        </w:rPr>
         <w:t xml:space="preserve"> de documento"</w:t>
       </w:r>
     </w:p>
@@ -4513,13 +4477,8 @@
         <w:pStyle w:val="APASEPTIMA"/>
       </w:pPr>
       <w:r>
-        <w:t xml:space="preserve">Y procedemos a copiar </w:t>
-      </w:r>
-      <w:proofErr w:type="gramStart"/>
-      <w:r>
-        <w:t>y  pegar</w:t>
-      </w:r>
-      <w:proofErr w:type="gramEnd"/>
+        <w:t>Y procedemos a copiar y  pegar</w:t>
+      </w:r>
       <w:r>
         <w:t xml:space="preserve"> en Git Bash</w:t>
       </w:r>
@@ -4940,16 +4899,36 @@
           <w:b/>
           <w:bCs/>
         </w:rPr>
+        <w:t xml:space="preserve"> add .</w:t>
+      </w:r>
+      <w:r>
+        <w:t xml:space="preserve">  Este es un comando que avisa al GitHub que se va a realizar un cambio.</w:t>
+      </w:r>
+    </w:p>
+    <w:p>
+      <w:pPr>
+        <w:pStyle w:val="APASEPTIMA"/>
+      </w:pPr>
+      <w:r>
+        <w:t>2</w:t>
+      </w:r>
+      <w:r>
         <w:t xml:space="preserve"> </w:t>
       </w:r>
       <w:proofErr w:type="spellStart"/>
-      <w:proofErr w:type="gramStart"/>
-      <w:r>
-        <w:rPr>
-          <w:b/>
-          <w:bCs/>
-        </w:rPr>
-        <w:t>add</w:t>
+      <w:r>
+        <w:rPr>
+          <w:b/>
+          <w:bCs/>
+        </w:rPr>
+        <w:t>g</w:t>
+      </w:r>
+      <w:r>
+        <w:rPr>
+          <w:b/>
+          <w:bCs/>
+        </w:rPr>
+        <w:t>it</w:t>
       </w:r>
       <w:proofErr w:type="spellEnd"/>
       <w:r>
@@ -4957,21 +4936,6 @@
           <w:b/>
           <w:bCs/>
         </w:rPr>
-        <w:t xml:space="preserve"> .</w:t>
-      </w:r>
-      <w:proofErr w:type="gramEnd"/>
-      <w:r>
-        <w:t xml:space="preserve">  Este es un comando que avisa al GitHub que se va a realizar un cambio.</w:t>
-      </w:r>
-    </w:p>
-    <w:p>
-      <w:pPr>
-        <w:pStyle w:val="APASEPTIMA"/>
-      </w:pPr>
-      <w:r>
-        <w:t>2</w:t>
-      </w:r>
-      <w:r>
         <w:t xml:space="preserve"> </w:t>
       </w:r>
       <w:proofErr w:type="spellStart"/>
@@ -4980,14 +4944,7 @@
           <w:b/>
           <w:bCs/>
         </w:rPr>
-        <w:t>g</w:t>
-      </w:r>
-      <w:r>
-        <w:rPr>
-          <w:b/>
-          <w:bCs/>
-        </w:rPr>
-        <w:t>it</w:t>
+        <w:t>commi</w:t>
       </w:r>
       <w:proofErr w:type="spellEnd"/>
       <w:r>
@@ -4995,15 +4952,36 @@
           <w:b/>
           <w:bCs/>
         </w:rPr>
+        <w:t xml:space="preserve"> -m</w:t>
+      </w:r>
+      <w:r>
+        <w:rPr>
+          <w:b/>
+          <w:bCs/>
+        </w:rPr>
         <w:t xml:space="preserve"> </w:t>
       </w:r>
+      <w:r>
+        <w:rPr>
+          <w:b/>
+          <w:bCs/>
+        </w:rPr>
+        <w:t>“segundo cambio:</w:t>
+      </w:r>
+      <w:r>
+        <w:rPr>
+          <w:b/>
+          <w:bCs/>
+        </w:rPr>
+        <w:t xml:space="preserve"> se </w:t>
+      </w:r>
       <w:proofErr w:type="spellStart"/>
       <w:r>
         <w:rPr>
           <w:b/>
           <w:bCs/>
         </w:rPr>
-        <w:t>commi</w:t>
+        <w:t>elimino</w:t>
       </w:r>
       <w:proofErr w:type="spellEnd"/>
       <w:r>
@@ -5011,36 +4989,53 @@
           <w:b/>
           <w:bCs/>
         </w:rPr>
-        <w:t xml:space="preserve"> -m</w:t>
-      </w:r>
-      <w:r>
-        <w:rPr>
-          <w:b/>
-          <w:bCs/>
-        </w:rPr>
+        <w:t xml:space="preserve"> el cuarto </w:t>
+      </w:r>
+      <w:r>
+        <w:rPr>
+          <w:b/>
+          <w:bCs/>
+        </w:rPr>
+        <w:t>párrafo”</w:t>
+      </w:r>
+      <w:r>
+        <w:t xml:space="preserve"> : Este el com</w:t>
+      </w:r>
+      <w:r>
+        <w:t>a</w:t>
+      </w:r>
+      <w:r>
+        <w:t xml:space="preserve">ndo de aviso de que se va hacer el cambio por ejemplo se va a eliminar algo o agregar algo al </w:t>
+      </w:r>
+      <w:r>
+        <w:t>archivo conjunto son un comentario.</w:t>
+      </w:r>
+    </w:p>
+    <w:p>
+      <w:pPr>
+        <w:pStyle w:val="APASEPTIMA"/>
+      </w:pPr>
+      <w:r>
+        <w:t xml:space="preserve">3 y por </w:t>
+      </w:r>
+      <w:proofErr w:type="spellStart"/>
+      <w:r>
+        <w:t>ultimo</w:t>
+      </w:r>
+      <w:proofErr w:type="spellEnd"/>
+      <w:r>
+        <w:t xml:space="preserve"> el comando</w:t>
+      </w:r>
+      <w:r>
         <w:t xml:space="preserve"> </w:t>
       </w:r>
-      <w:r>
-        <w:rPr>
-          <w:b/>
-          <w:bCs/>
-        </w:rPr>
-        <w:t>“segundo cambio:</w:t>
-      </w:r>
-      <w:r>
-        <w:rPr>
-          <w:b/>
-          <w:bCs/>
-        </w:rPr>
-        <w:t xml:space="preserve"> se </w:t>
-      </w:r>
       <w:proofErr w:type="spellStart"/>
       <w:r>
         <w:rPr>
           <w:b/>
           <w:bCs/>
         </w:rPr>
-        <w:t>elimino</w:t>
+        <w:t>git</w:t>
       </w:r>
       <w:proofErr w:type="spellEnd"/>
       <w:r>
@@ -5048,85 +5043,18 @@
           <w:b/>
           <w:bCs/>
         </w:rPr>
-        <w:t xml:space="preserve"> el cuarto </w:t>
-      </w:r>
-      <w:r>
-        <w:rPr>
-          <w:b/>
-          <w:bCs/>
-        </w:rPr>
-        <w:t>párrafo</w:t>
-      </w:r>
-      <w:proofErr w:type="gramStart"/>
-      <w:r>
-        <w:rPr>
-          <w:b/>
-          <w:bCs/>
-        </w:rPr>
-        <w:t>”</w:t>
-      </w:r>
-      <w:r>
-        <w:t xml:space="preserve"> :</w:t>
-      </w:r>
-      <w:proofErr w:type="gramEnd"/>
-      <w:r>
-        <w:t xml:space="preserve"> Este el com</w:t>
-      </w:r>
-      <w:r>
-        <w:t>a</w:t>
-      </w:r>
-      <w:r>
-        <w:t xml:space="preserve">ndo de aviso de que se va hacer el cambio por ejemplo se va a eliminar algo o agregar algo al </w:t>
-      </w:r>
-      <w:r>
-        <w:t>archivo conjunto son un comentario.</w:t>
-      </w:r>
-    </w:p>
-    <w:p>
-      <w:pPr>
-        <w:pStyle w:val="APASEPTIMA"/>
-      </w:pPr>
-      <w:r>
-        <w:t xml:space="preserve">3 y por </w:t>
+        <w:t xml:space="preserve"> </w:t>
       </w:r>
       <w:proofErr w:type="spellStart"/>
       <w:r>
-        <w:t>ultimo</w:t>
+        <w:rPr>
+          <w:b/>
+          <w:bCs/>
+        </w:rPr>
+        <w:t>push</w:t>
       </w:r>
       <w:proofErr w:type="spellEnd"/>
       <w:r>
-        <w:t xml:space="preserve"> el comando</w:t>
-      </w:r>
-      <w:r>
-        <w:t xml:space="preserve"> </w:t>
-      </w:r>
-      <w:proofErr w:type="spellStart"/>
-      <w:r>
-        <w:rPr>
-          <w:b/>
-          <w:bCs/>
-        </w:rPr>
-        <w:t>git</w:t>
-      </w:r>
-      <w:proofErr w:type="spellEnd"/>
-      <w:r>
-        <w:rPr>
-          <w:b/>
-          <w:bCs/>
-        </w:rPr>
-        <w:t xml:space="preserve"> </w:t>
-      </w:r>
-      <w:proofErr w:type="spellStart"/>
-      <w:proofErr w:type="gramStart"/>
-      <w:r>
-        <w:rPr>
-          <w:b/>
-          <w:bCs/>
-        </w:rPr>
-        <w:t>push</w:t>
-      </w:r>
-      <w:proofErr w:type="spellEnd"/>
-      <w:r>
         <w:rPr>
           <w:b/>
           <w:bCs/>
@@ -5137,11 +5065,7 @@
         <w:t>q</w:t>
       </w:r>
       <w:r>
-        <w:t>ue</w:t>
-      </w:r>
-      <w:proofErr w:type="gramEnd"/>
-      <w:r>
-        <w:t xml:space="preserve"> </w:t>
+        <w:t xml:space="preserve">ue </w:t>
       </w:r>
       <w:r>
         <w:t>confirma a GitHub que ya se efectuó un cambio.</w:t>
@@ -5329,12 +5253,27 @@
           <w:lang w:val="es-MX"/>
         </w:rPr>
       </w:pPr>
+      <w:hyperlink r:id="rId23" w:history="1">
+        <w:r>
+          <w:rPr>
+            <w:rStyle w:val="Hipervnculo"/>
+            <w:lang w:val="es-MX"/>
+          </w:rPr>
+          <w:t>https://github.com/jparrales5335-hub/SISTEMA-CONTROL-RESCATE-ADOPCION-ANIMAL</w:t>
+        </w:r>
+      </w:hyperlink>
+      <w:r>
+        <w:rPr>
+          <w:lang w:val="es-MX"/>
+        </w:rPr>
+        <w:t xml:space="preserve"> </w:t>
+      </w:r>
     </w:p>
     <w:sectPr>
-      <w:headerReference w:type="even" r:id="rId23"/>
-      <w:headerReference w:type="default" r:id="rId24"/>
-      <w:footerReference w:type="default" r:id="rId25"/>
-      <w:headerReference w:type="first" r:id="rId26"/>
+      <w:headerReference w:type="even" r:id="rId24"/>
+      <w:headerReference w:type="default" r:id="rId25"/>
+      <w:footerReference w:type="default" r:id="rId26"/>
+      <w:headerReference w:type="first" r:id="rId27"/>
       <w:type w:val="continuous"/>
       <w:pgSz w:w="12240" w:h="15840" w:code="1"/>
       <w:pgMar w:top="1440" w:right="1440" w:bottom="1440" w:left="1440" w:header="397" w:footer="227" w:gutter="0"/>

</xml_diff>